<commit_message>
feat(template): harden exemplars and publication indexing
</commit_message>
<xml_diff>
--- a/output/templates/template_textbook/docx/templates/template_textbook_combined.docx
+++ b/output/templates/template_textbook/docx/templates/template_textbook_combined.docx
@@ -885,7 +885,7 @@
         <w:rPr>
           <w:rStyle w:val="NormalTok"/>
         </w:rPr>
-        <w:t xml:space="preserve"> run python scripts/02_run_analysis.py </w:t>
+        <w:t xml:space="preserve"> run python scripts/pipeline/stage_02_analysis.py </w:t>
       </w:r>
       <w:r>
         <w:rPr>
@@ -912,7 +912,7 @@
         <w:rPr>
           <w:rStyle w:val="NormalTok"/>
         </w:rPr>
-        <w:t xml:space="preserve"> run python scripts/03_render_pdf.py    </w:t>
+        <w:t xml:space="preserve"> run python scripts/pipeline/stage_03_render.py    </w:t>
       </w:r>
       <w:r>
         <w:rPr>
@@ -32069,7 +32069,7 @@
     </w:p>
     <w:bookmarkEnd w:id="402"/>
     <w:bookmarkEnd w:id="403"/>
-    <w:bookmarkStart w:id="445" w:name="sec:appendix_format_gallery"/>
+    <w:bookmarkStart w:id="444" w:name="sec:appendix_format_gallery"/>
     <w:p>
       <w:pPr>
         <w:pStyle w:val="Heading1"/>
@@ -32310,13 +32310,28 @@
         <w:pStyle w:val="BodyText"/>
       </w:pPr>
       <w:r>
-        <w:t xml:space="preserve">You can hard-break a line</w:t>
-      </w:r>
-      <w:r>
-        <w:br/>
-      </w:r>
-      <w:r>
-        <w:t xml:space="preserve">with two trailing spaces, or separate paragraphs with a blank line. Escape</w:t>
+        <w:t xml:space="preserve">You can hard-break a line with an explicit</w:t>
+      </w:r>
+      <w:r>
+        <w:t xml:space="preserve"> </w:t>
+      </w:r>
+      <w:r>
+        <w:rPr>
+          <w:rStyle w:val="VerbatimChar"/>
+        </w:rPr>
+        <w:t xml:space="preserve">&lt;br&gt;</w:t>
+      </w:r>
+      <w:r>
+        <w:t xml:space="preserve"> </w:t>
+      </w:r>
+      <w:r>
+        <w:t xml:space="preserve">element,</w:t>
+      </w:r>
+      <w:r>
+        <w:t xml:space="preserve"> </w:t>
+      </w:r>
+      <w:r>
+        <w:t xml:space="preserve">or separate paragraphs with a blank line. Escape</w:t>
       </w:r>
       <w:r>
         <w:t xml:space="preserve"> </w:t>
@@ -32831,7 +32846,7 @@
       </w:r>
     </w:p>
     <w:bookmarkEnd w:id="407"/>
-    <w:bookmarkStart w:id="409" w:name="tables"/>
+    <w:bookmarkStart w:id="408" w:name="tables"/>
     <w:p>
       <w:pPr>
         <w:pStyle w:val="Heading2"/>
@@ -32851,16 +32866,54 @@
         <w:t xml:space="preserve"> </w:t>
       </w:r>
       <w:r>
-        <w:t xml:space="preserve">(tbl. 14):</w:t>
-      </w:r>
-    </w:p>
-    <w:bookmarkStart w:id="408" w:name="tbl:gallery_alignment"/>
-    <w:p>
-      <w:pPr>
-        <w:pStyle w:val="TableCaption"/>
-      </w:pPr>
-      <w:r>
-        <w:t xml:space="preserve">Table 14: Column alignment — left, centre, right.</w:t>
+        <w:t xml:space="preserve">(tbl. </w:t>
+      </w:r>
+      <w:r>
+        <w:rPr>
+          <w:b/>
+          <w:bCs/>
+        </w:rPr>
+        <w:t xml:space="preserve">¿tbl:gallery_alignment?</w:t>
+      </w:r>
+      <w:r>
+        <w:t xml:space="preserve">):</w:t>
+      </w:r>
+    </w:p>
+    <w:p>
+      <w:pPr>
+        <w:pStyle w:val="BodyText"/>
+      </w:pPr>
+      <w:r>
+        <w:t xml:space="preserve">: Column alignment — left, centre, right. {#tbl:gallery_alignment}</w:t>
+      </w:r>
+    </w:p>
+    <w:p>
+      <w:pPr>
+        <w:pStyle w:val="BodyText"/>
+      </w:pPr>
+      <w:r>
+        <w:t xml:space="preserve">The values below are mirrored in</w:t>
+      </w:r>
+      <w:r>
+        <w:t xml:space="preserve"> </w:t>
+      </w:r>
+      <w:r>
+        <w:rPr>
+          <w:rStyle w:val="VerbatimChar"/>
+        </w:rPr>
+        <w:t xml:space="preserve">manuscript/assets/data/format_gallery.csv</w:t>
+      </w:r>
+      <w:r>
+        <w:t xml:space="preserve"> </w:t>
+      </w:r>
+      <w:r>
+        <w:t xml:space="preserve">so</w:t>
+      </w:r>
+      <w:r>
+        <w:t xml:space="preserve"> </w:t>
+      </w:r>
+      <w:r>
+        <w:t xml:space="preserve">rendering examples remain evidence-addressable fixtures rather than anonymous literals.</w:t>
       </w:r>
     </w:p>
     <w:tbl>
@@ -32868,7 +32921,6 @@
         <w:tblStyle w:val="Table"/>
         <w:tblW w:type="auto" w:w="0"/>
         <w:tblLook w:firstRow="1" w:lastRow="0" w:firstColumn="0" w:lastColumn="0" w:noHBand="0" w:noVBand="0" w:val="0020"/>
-        <w:tblCaption w:val="Table 14: Column alignment — left, centre, right."/>
       </w:tblPr>
       <w:tblGrid>
         <w:gridCol w:w="2640"/>
@@ -33031,7 +33083,6 @@
         </w:tc>
       </w:tr>
     </w:tbl>
-    <w:bookmarkEnd w:id="408"/>
     <w:p>
       <w:pPr>
         <w:pStyle w:val="BodyText"/>
@@ -33190,8 +33241,8 @@
         </w:pict>
       </w:r>
     </w:p>
-    <w:bookmarkEnd w:id="409"/>
-    <w:bookmarkStart w:id="411" w:name="mathematics-and-units"/>
+    <w:bookmarkEnd w:id="408"/>
+    <w:bookmarkStart w:id="410" w:name="mathematics-and-units"/>
     <w:p>
       <w:pPr>
         <w:pStyle w:val="Heading2"/>
@@ -33273,7 +33324,7 @@
       <w:pPr>
         <w:pStyle w:val="BodyText"/>
       </w:pPr>
-      <w:bookmarkStart w:id="410" w:name="eq:gallery_logistic"/>
+      <w:bookmarkStart w:id="409" w:name="eq:gallery_logistic"/>
       <m:oMathPara>
         <m:oMathParaPr>
           <m:jc m:val="center"/>
@@ -33417,7 +33468,7 @@
           </m:r>
         </m:oMath>
       </m:oMathPara>
-      <w:bookmarkEnd w:id="410"/>
+      <w:bookmarkEnd w:id="409"/>
     </w:p>
     <w:p>
       <w:pPr>
@@ -33992,8 +34043,8 @@
         </w:pict>
       </w:r>
     </w:p>
-    <w:bookmarkEnd w:id="411"/>
-    <w:bookmarkStart w:id="428" w:name="figures"/>
+    <w:bookmarkEnd w:id="410"/>
+    <w:bookmarkStart w:id="427" w:name="figures"/>
     <w:p>
       <w:pPr>
         <w:pStyle w:val="Heading2"/>
@@ -34016,7 +34067,7 @@
         <w:t xml:space="preserve">fig. 13:</w:t>
       </w:r>
     </w:p>
-    <w:bookmarkStart w:id="415" w:name="fig:gallery_line"/>
+    <w:bookmarkStart w:id="414" w:name="fig:gallery_line"/>
     <w:p>
       <w:pPr>
         <w:pStyle w:val="CaptionedFigure"/>
@@ -34026,18 +34077,18 @@
           <wp:inline>
             <wp:extent cx="4267200" cy="2804573"/>
             <wp:effectExtent b="0" l="0" r="0" t="0"/>
-            <wp:docPr descr="Figure 13: A multi-series line plot of three sine waves, produced by visualization.gallery.line_plot." title="" id="413" name="Picture"/>
+            <wp:docPr descr="Figure 13: A multi-series line plot of three sine waves, produced by visualization.gallery.line_plot." title="" id="412" name="Picture"/>
             <a:graphic>
               <a:graphicData uri="http://schemas.openxmlformats.org/drawingml/2006/picture">
                 <pic:pic>
                   <pic:nvPicPr>
-                    <pic:cNvPr descr="../figures/gallery/gallery_line.png" id="414" name="Picture"/>
+                    <pic:cNvPr descr="../figures/gallery/gallery_line.png" id="413" name="Picture"/>
                     <pic:cNvPicPr>
                       <a:picLocks noChangeArrowheads="1" noChangeAspect="1"/>
                     </pic:cNvPicPr>
                   </pic:nvPicPr>
                   <pic:blipFill>
-                    <a:blip r:embed="rId412"/>
+                    <a:blip r:embed="rId411"/>
                     <a:stretch>
                       <a:fillRect/>
                     </a:stretch>
@@ -34084,7 +34135,7 @@
         <w:t xml:space="preserve">.</w:t>
       </w:r>
     </w:p>
-    <w:bookmarkEnd w:id="415"/>
+    <w:bookmarkEnd w:id="414"/>
     <w:p>
       <w:pPr>
         <w:pStyle w:val="BodyText"/>
@@ -34093,7 +34144,7 @@
         <w:t xml:space="preserve">Two figures side by side (Pandoc fenced div; falls back to stacked):</w:t>
       </w:r>
     </w:p>
-    <w:bookmarkStart w:id="419" w:name="fig:gallery_bar"/>
+    <w:bookmarkStart w:id="418" w:name="fig:gallery_bar"/>
     <w:p>
       <w:pPr>
         <w:pStyle w:val="CaptionedFigure"/>
@@ -34103,18 +34154,18 @@
           <wp:inline>
             <wp:extent cx="2560320" cy="1685640"/>
             <wp:effectExtent b="0" l="0" r="0" t="0"/>
-            <wp:docPr descr="Figure 14: Bar chart." title="" id="417" name="Picture"/>
+            <wp:docPr descr="Figure 14: Bar chart." title="" id="416" name="Picture"/>
             <a:graphic>
               <a:graphicData uri="http://schemas.openxmlformats.org/drawingml/2006/picture">
                 <pic:pic>
                   <pic:nvPicPr>
-                    <pic:cNvPr descr="../figures/gallery/gallery_bar.png" id="418" name="Picture"/>
+                    <pic:cNvPr descr="../figures/gallery/gallery_bar.png" id="417" name="Picture"/>
                     <pic:cNvPicPr>
                       <a:picLocks noChangeArrowheads="1" noChangeAspect="1"/>
                     </pic:cNvPicPr>
                   </pic:nvPicPr>
                   <pic:blipFill>
-                    <a:blip r:embed="rId416"/>
+                    <a:blip r:embed="rId415"/>
                     <a:stretch>
                       <a:fillRect/>
                     </a:stretch>
@@ -34149,8 +34200,8 @@
         <w:t xml:space="preserve">Figure 14: Bar chart.</w:t>
       </w:r>
     </w:p>
-    <w:bookmarkEnd w:id="419"/>
-    <w:bookmarkStart w:id="423" w:name="fig:gallery_pie"/>
+    <w:bookmarkEnd w:id="418"/>
+    <w:bookmarkStart w:id="422" w:name="fig:gallery_pie"/>
     <w:p>
       <w:pPr>
         <w:pStyle w:val="CaptionedFigure"/>
@@ -34160,18 +34211,18 @@
           <wp:inline>
             <wp:extent cx="2560320" cy="2497015"/>
             <wp:effectExtent b="0" l="0" r="0" t="0"/>
-            <wp:docPr descr="Figure 15: Pie chart." title="" id="421" name="Picture"/>
+            <wp:docPr descr="Figure 15: Pie chart." title="" id="420" name="Picture"/>
             <a:graphic>
               <a:graphicData uri="http://schemas.openxmlformats.org/drawingml/2006/picture">
                 <pic:pic>
                   <pic:nvPicPr>
-                    <pic:cNvPr descr="../figures/gallery/gallery_pie.png" id="422" name="Picture"/>
+                    <pic:cNvPr descr="../figures/gallery/gallery_pie.png" id="421" name="Picture"/>
                     <pic:cNvPicPr>
                       <a:picLocks noChangeArrowheads="1" noChangeAspect="1"/>
                     </pic:cNvPicPr>
                   </pic:nvPicPr>
                   <pic:blipFill>
-                    <a:blip r:embed="rId420"/>
+                    <a:blip r:embed="rId419"/>
                     <a:stretch>
                       <a:fillRect/>
                     </a:stretch>
@@ -34206,7 +34257,7 @@
         <w:t xml:space="preserve">Figure 15: Pie chart.</w:t>
       </w:r>
     </w:p>
-    <w:bookmarkEnd w:id="423"/>
+    <w:bookmarkEnd w:id="422"/>
     <w:p>
       <w:pPr>
         <w:pStyle w:val="BodyText"/>
@@ -34215,7 +34266,7 @@
         <w:t xml:space="preserve">A multi-panel composite (fig. 16):</w:t>
       </w:r>
     </w:p>
-    <w:bookmarkStart w:id="427" w:name="fig:gallery_multipanel"/>
+    <w:bookmarkStart w:id="426" w:name="fig:gallery_multipanel"/>
     <w:p>
       <w:pPr>
         <w:pStyle w:val="CaptionedFigure"/>
@@ -34225,18 +34276,18 @@
           <wp:inline>
             <wp:extent cx="4533900" cy="3397555"/>
             <wp:effectExtent b="0" l="0" r="0" t="0"/>
-            <wp:docPr descr="Figure 16: A 2×2 composite: line, scatter, bar, and histogram panels." title="" id="425" name="Picture"/>
+            <wp:docPr descr="Figure 16: A 2×2 composite: line, scatter, bar, and histogram panels." title="" id="424" name="Picture"/>
             <a:graphic>
               <a:graphicData uri="http://schemas.openxmlformats.org/drawingml/2006/picture">
                 <pic:pic>
                   <pic:nvPicPr>
-                    <pic:cNvPr descr="../figures/gallery/gallery_multipanel.png" id="426" name="Picture"/>
+                    <pic:cNvPr descr="../figures/gallery/gallery_multipanel.png" id="425" name="Picture"/>
                     <pic:cNvPicPr>
                       <a:picLocks noChangeArrowheads="1" noChangeAspect="1"/>
                     </pic:cNvPicPr>
                   </pic:nvPicPr>
                   <pic:blipFill>
-                    <a:blip r:embed="rId424"/>
+                    <a:blip r:embed="rId423"/>
                     <a:stretch>
                       <a:fillRect/>
                     </a:stretch>
@@ -34277,7 +34328,7 @@
         <w:t xml:space="preserve">panels.</w:t>
       </w:r>
     </w:p>
-    <w:bookmarkEnd w:id="427"/>
+    <w:bookmarkEnd w:id="426"/>
     <w:p>
       <w:pPr>
         <w:pStyle w:val="BodyText"/>
@@ -34329,8 +34380,8 @@
         </w:pict>
       </w:r>
     </w:p>
-    <w:bookmarkEnd w:id="428"/>
-    <w:bookmarkStart w:id="429" w:name="diagrams-mermaid"/>
+    <w:bookmarkEnd w:id="427"/>
+    <w:bookmarkStart w:id="428" w:name="diagrams-mermaid"/>
     <w:p>
       <w:pPr>
         <w:pStyle w:val="Heading2"/>
@@ -34474,290 +34525,290 @@
         </w:pict>
       </w:r>
     </w:p>
+    <w:bookmarkEnd w:id="428"/>
+    <w:bookmarkStart w:id="430" w:name="code"/>
+    <w:p>
+      <w:pPr>
+        <w:pStyle w:val="Heading2"/>
+      </w:pPr>
+      <w:r>
+        <w:t xml:space="preserve">8. Code</w:t>
+      </w:r>
+    </w:p>
+    <w:p>
+      <w:pPr>
+        <w:pStyle w:val="FirstParagraph"/>
+      </w:pPr>
+      <w:r>
+        <w:t xml:space="preserve">Inline code: call</w:t>
+      </w:r>
+      <w:r>
+        <w:t xml:space="preserve"> </w:t>
+      </w:r>
+      <w:r>
+        <w:rPr>
+          <w:rStyle w:val="VerbatimChar"/>
+        </w:rPr>
+        <w:t xml:space="preserve">textbook.models.logistic_growth(t, r=..., ...)</w:t>
+      </w:r>
+      <w:r>
+        <w:t xml:space="preserve">.</w:t>
+      </w:r>
+    </w:p>
+    <w:p>
+      <w:pPr>
+        <w:pStyle w:val="BodyText"/>
+      </w:pPr>
+      <w:r>
+        <w:t xml:space="preserve">A fenced code block with a language (syntax-highlighted) and a caption</w:t>
+      </w:r>
+      <w:r>
+        <w:t xml:space="preserve"> </w:t>
+      </w:r>
+      <w:r>
+        <w:t xml:space="preserve">(lst. 1):</w:t>
+      </w:r>
+    </w:p>
+    <w:bookmarkStart w:id="429" w:name="lst:gallery_code"/>
+    <w:p>
+      <w:pPr>
+        <w:pStyle w:val="Caption"/>
+      </w:pPr>
+      <w:r>
+        <w:t xml:space="preserve">Listing 1: Calling the tested computational backbone.</w:t>
+      </w:r>
+    </w:p>
+    <w:p>
+      <w:pPr>
+        <w:pStyle w:val="SourceCode"/>
+      </w:pPr>
+      <w:r>
+        <w:rPr>
+          <w:rStyle w:val="ImportTok"/>
+        </w:rPr>
+        <w:t xml:space="preserve">from</w:t>
+      </w:r>
+      <w:r>
+        <w:rPr>
+          <w:rStyle w:val="NormalTok"/>
+        </w:rPr>
+        <w:t xml:space="preserve"> textbook </w:t>
+      </w:r>
+      <w:r>
+        <w:rPr>
+          <w:rStyle w:val="ImportTok"/>
+        </w:rPr>
+        <w:t xml:space="preserve">import</w:t>
+      </w:r>
+      <w:r>
+        <w:rPr>
+          <w:rStyle w:val="NormalTok"/>
+        </w:rPr>
+        <w:t xml:space="preserve"> models</w:t>
+      </w:r>
+      <w:r>
+        <w:br/>
+      </w:r>
+      <w:r>
+        <w:rPr>
+          <w:rStyle w:val="ImportTok"/>
+        </w:rPr>
+        <w:t xml:space="preserve">import</w:t>
+      </w:r>
+      <w:r>
+        <w:rPr>
+          <w:rStyle w:val="NormalTok"/>
+        </w:rPr>
+        <w:t xml:space="preserve"> numpy </w:t>
+      </w:r>
+      <w:r>
+        <w:rPr>
+          <w:rStyle w:val="ImportTok"/>
+        </w:rPr>
+        <w:t xml:space="preserve">as</w:t>
+      </w:r>
+      <w:r>
+        <w:rPr>
+          <w:rStyle w:val="NormalTok"/>
+        </w:rPr>
+        <w:t xml:space="preserve"> np</w:t>
+      </w:r>
+      <w:r>
+        <w:br/>
+      </w:r>
+      <w:r>
+        <w:br/>
+      </w:r>
+      <w:r>
+        <w:rPr>
+          <w:rStyle w:val="NormalTok"/>
+        </w:rPr>
+        <w:t xml:space="preserve">t </w:t>
+      </w:r>
+      <w:r>
+        <w:rPr>
+          <w:rStyle w:val="OperatorTok"/>
+        </w:rPr>
+        <w:t xml:space="preserve">=</w:t>
+      </w:r>
+      <w:r>
+        <w:rPr>
+          <w:rStyle w:val="NormalTok"/>
+        </w:rPr>
+        <w:t xml:space="preserve"> np.linspace(</w:t>
+      </w:r>
+      <w:r>
+        <w:rPr>
+          <w:rStyle w:val="DecValTok"/>
+        </w:rPr>
+        <w:t xml:space="preserve">0</w:t>
+      </w:r>
+      <w:r>
+        <w:rPr>
+          <w:rStyle w:val="NormalTok"/>
+        </w:rPr>
+        <w:t xml:space="preserve">, </w:t>
+      </w:r>
+      <w:r>
+        <w:rPr>
+          <w:rStyle w:val="DecValTok"/>
+        </w:rPr>
+        <w:t xml:space="preserve">10</w:t>
+      </w:r>
+      <w:r>
+        <w:rPr>
+          <w:rStyle w:val="NormalTok"/>
+        </w:rPr>
+        <w:t xml:space="preserve">, </w:t>
+      </w:r>
+      <w:r>
+        <w:rPr>
+          <w:rStyle w:val="DecValTok"/>
+        </w:rPr>
+        <w:t xml:space="preserve">100</w:t>
+      </w:r>
+      <w:r>
+        <w:rPr>
+          <w:rStyle w:val="NormalTok"/>
+        </w:rPr>
+        <w:t xml:space="preserve">)</w:t>
+      </w:r>
+      <w:r>
+        <w:br/>
+      </w:r>
+      <w:r>
+        <w:rPr>
+          <w:rStyle w:val="NormalTok"/>
+        </w:rPr>
+        <w:t xml:space="preserve">n </w:t>
+      </w:r>
+      <w:r>
+        <w:rPr>
+          <w:rStyle w:val="OperatorTok"/>
+        </w:rPr>
+        <w:t xml:space="preserve">=</w:t>
+      </w:r>
+      <w:r>
+        <w:rPr>
+          <w:rStyle w:val="NormalTok"/>
+        </w:rPr>
+        <w:t xml:space="preserve"> models.logistic_growth(t, r</w:t>
+      </w:r>
+      <w:r>
+        <w:rPr>
+          <w:rStyle w:val="OperatorTok"/>
+        </w:rPr>
+        <w:t xml:space="preserve">=</w:t>
+      </w:r>
+      <w:r>
+        <w:rPr>
+          <w:rStyle w:val="FloatTok"/>
+        </w:rPr>
+        <w:t xml:space="preserve">0.8</w:t>
+      </w:r>
+      <w:r>
+        <w:rPr>
+          <w:rStyle w:val="NormalTok"/>
+        </w:rPr>
+        <w:t xml:space="preserve">, carrying_capacity</w:t>
+      </w:r>
+      <w:r>
+        <w:rPr>
+          <w:rStyle w:val="OperatorTok"/>
+        </w:rPr>
+        <w:t xml:space="preserve">=</w:t>
+      </w:r>
+      <w:r>
+        <w:rPr>
+          <w:rStyle w:val="FloatTok"/>
+        </w:rPr>
+        <w:t xml:space="preserve">100.0</w:t>
+      </w:r>
+      <w:r>
+        <w:rPr>
+          <w:rStyle w:val="NormalTok"/>
+        </w:rPr>
+        <w:t xml:space="preserve">, initial</w:t>
+      </w:r>
+      <w:r>
+        <w:rPr>
+          <w:rStyle w:val="OperatorTok"/>
+        </w:rPr>
+        <w:t xml:space="preserve">=</w:t>
+      </w:r>
+      <w:r>
+        <w:rPr>
+          <w:rStyle w:val="FloatTok"/>
+        </w:rPr>
+        <w:t xml:space="preserve">5.0</w:t>
+      </w:r>
+      <w:r>
+        <w:rPr>
+          <w:rStyle w:val="NormalTok"/>
+        </w:rPr>
+        <w:t xml:space="preserve">)</w:t>
+      </w:r>
+      <w:r>
+        <w:br/>
+      </w:r>
+      <w:r>
+        <w:rPr>
+          <w:rStyle w:val="BuiltInTok"/>
+        </w:rPr>
+        <w:t xml:space="preserve">print</w:t>
+      </w:r>
+      <w:r>
+        <w:rPr>
+          <w:rStyle w:val="NormalTok"/>
+        </w:rPr>
+        <w:t xml:space="preserve">(n[</w:t>
+      </w:r>
+      <w:r>
+        <w:rPr>
+          <w:rStyle w:val="OperatorTok"/>
+        </w:rPr>
+        <w:t xml:space="preserve">-</w:t>
+      </w:r>
+      <w:r>
+        <w:rPr>
+          <w:rStyle w:val="DecValTok"/>
+        </w:rPr>
+        <w:t xml:space="preserve">1</w:t>
+      </w:r>
+      <w:r>
+        <w:rPr>
+          <w:rStyle w:val="NormalTok"/>
+        </w:rPr>
+        <w:t xml:space="preserve">])  </w:t>
+      </w:r>
+      <w:r>
+        <w:rPr>
+          <w:rStyle w:val="CommentTok"/>
+        </w:rPr>
+        <w:t xml:space="preserve"># -&gt; approaches the carrying capacity</w:t>
+      </w:r>
+    </w:p>
     <w:bookmarkEnd w:id="429"/>
-    <w:bookmarkStart w:id="431" w:name="code"/>
-    <w:p>
-      <w:pPr>
-        <w:pStyle w:val="Heading2"/>
-      </w:pPr>
-      <w:r>
-        <w:t xml:space="preserve">8. Code</w:t>
-      </w:r>
-    </w:p>
-    <w:p>
-      <w:pPr>
-        <w:pStyle w:val="FirstParagraph"/>
-      </w:pPr>
-      <w:r>
-        <w:t xml:space="preserve">Inline code: call</w:t>
-      </w:r>
-      <w:r>
-        <w:t xml:space="preserve"> </w:t>
-      </w:r>
-      <w:r>
-        <w:rPr>
-          <w:rStyle w:val="VerbatimChar"/>
-        </w:rPr>
-        <w:t xml:space="preserve">textbook.models.logistic_growth(t, r=..., ...)</w:t>
-      </w:r>
-      <w:r>
-        <w:t xml:space="preserve">.</w:t>
-      </w:r>
-    </w:p>
-    <w:p>
-      <w:pPr>
-        <w:pStyle w:val="BodyText"/>
-      </w:pPr>
-      <w:r>
-        <w:t xml:space="preserve">A fenced code block with a language (syntax-highlighted) and a caption</w:t>
-      </w:r>
-      <w:r>
-        <w:t xml:space="preserve"> </w:t>
-      </w:r>
-      <w:r>
-        <w:t xml:space="preserve">(lst. 1):</w:t>
-      </w:r>
-    </w:p>
-    <w:bookmarkStart w:id="430" w:name="lst:gallery_code"/>
-    <w:p>
-      <w:pPr>
-        <w:pStyle w:val="Caption"/>
-      </w:pPr>
-      <w:r>
-        <w:t xml:space="preserve">Listing 1: Calling the tested computational backbone.</w:t>
-      </w:r>
-    </w:p>
-    <w:p>
-      <w:pPr>
-        <w:pStyle w:val="SourceCode"/>
-      </w:pPr>
-      <w:r>
-        <w:rPr>
-          <w:rStyle w:val="ImportTok"/>
-        </w:rPr>
-        <w:t xml:space="preserve">from</w:t>
-      </w:r>
-      <w:r>
-        <w:rPr>
-          <w:rStyle w:val="NormalTok"/>
-        </w:rPr>
-        <w:t xml:space="preserve"> textbook </w:t>
-      </w:r>
-      <w:r>
-        <w:rPr>
-          <w:rStyle w:val="ImportTok"/>
-        </w:rPr>
-        <w:t xml:space="preserve">import</w:t>
-      </w:r>
-      <w:r>
-        <w:rPr>
-          <w:rStyle w:val="NormalTok"/>
-        </w:rPr>
-        <w:t xml:space="preserve"> models</w:t>
-      </w:r>
-      <w:r>
-        <w:br/>
-      </w:r>
-      <w:r>
-        <w:rPr>
-          <w:rStyle w:val="ImportTok"/>
-        </w:rPr>
-        <w:t xml:space="preserve">import</w:t>
-      </w:r>
-      <w:r>
-        <w:rPr>
-          <w:rStyle w:val="NormalTok"/>
-        </w:rPr>
-        <w:t xml:space="preserve"> numpy </w:t>
-      </w:r>
-      <w:r>
-        <w:rPr>
-          <w:rStyle w:val="ImportTok"/>
-        </w:rPr>
-        <w:t xml:space="preserve">as</w:t>
-      </w:r>
-      <w:r>
-        <w:rPr>
-          <w:rStyle w:val="NormalTok"/>
-        </w:rPr>
-        <w:t xml:space="preserve"> np</w:t>
-      </w:r>
-      <w:r>
-        <w:br/>
-      </w:r>
-      <w:r>
-        <w:br/>
-      </w:r>
-      <w:r>
-        <w:rPr>
-          <w:rStyle w:val="NormalTok"/>
-        </w:rPr>
-        <w:t xml:space="preserve">t </w:t>
-      </w:r>
-      <w:r>
-        <w:rPr>
-          <w:rStyle w:val="OperatorTok"/>
-        </w:rPr>
-        <w:t xml:space="preserve">=</w:t>
-      </w:r>
-      <w:r>
-        <w:rPr>
-          <w:rStyle w:val="NormalTok"/>
-        </w:rPr>
-        <w:t xml:space="preserve"> np.linspace(</w:t>
-      </w:r>
-      <w:r>
-        <w:rPr>
-          <w:rStyle w:val="DecValTok"/>
-        </w:rPr>
-        <w:t xml:space="preserve">0</w:t>
-      </w:r>
-      <w:r>
-        <w:rPr>
-          <w:rStyle w:val="NormalTok"/>
-        </w:rPr>
-        <w:t xml:space="preserve">, </w:t>
-      </w:r>
-      <w:r>
-        <w:rPr>
-          <w:rStyle w:val="DecValTok"/>
-        </w:rPr>
-        <w:t xml:space="preserve">10</w:t>
-      </w:r>
-      <w:r>
-        <w:rPr>
-          <w:rStyle w:val="NormalTok"/>
-        </w:rPr>
-        <w:t xml:space="preserve">, </w:t>
-      </w:r>
-      <w:r>
-        <w:rPr>
-          <w:rStyle w:val="DecValTok"/>
-        </w:rPr>
-        <w:t xml:space="preserve">100</w:t>
-      </w:r>
-      <w:r>
-        <w:rPr>
-          <w:rStyle w:val="NormalTok"/>
-        </w:rPr>
-        <w:t xml:space="preserve">)</w:t>
-      </w:r>
-      <w:r>
-        <w:br/>
-      </w:r>
-      <w:r>
-        <w:rPr>
-          <w:rStyle w:val="NormalTok"/>
-        </w:rPr>
-        <w:t xml:space="preserve">n </w:t>
-      </w:r>
-      <w:r>
-        <w:rPr>
-          <w:rStyle w:val="OperatorTok"/>
-        </w:rPr>
-        <w:t xml:space="preserve">=</w:t>
-      </w:r>
-      <w:r>
-        <w:rPr>
-          <w:rStyle w:val="NormalTok"/>
-        </w:rPr>
-        <w:t xml:space="preserve"> models.logistic_growth(t, r</w:t>
-      </w:r>
-      <w:r>
-        <w:rPr>
-          <w:rStyle w:val="OperatorTok"/>
-        </w:rPr>
-        <w:t xml:space="preserve">=</w:t>
-      </w:r>
-      <w:r>
-        <w:rPr>
-          <w:rStyle w:val="FloatTok"/>
-        </w:rPr>
-        <w:t xml:space="preserve">0.8</w:t>
-      </w:r>
-      <w:r>
-        <w:rPr>
-          <w:rStyle w:val="NormalTok"/>
-        </w:rPr>
-        <w:t xml:space="preserve">, carrying_capacity</w:t>
-      </w:r>
-      <w:r>
-        <w:rPr>
-          <w:rStyle w:val="OperatorTok"/>
-        </w:rPr>
-        <w:t xml:space="preserve">=</w:t>
-      </w:r>
-      <w:r>
-        <w:rPr>
-          <w:rStyle w:val="FloatTok"/>
-        </w:rPr>
-        <w:t xml:space="preserve">100.0</w:t>
-      </w:r>
-      <w:r>
-        <w:rPr>
-          <w:rStyle w:val="NormalTok"/>
-        </w:rPr>
-        <w:t xml:space="preserve">, initial</w:t>
-      </w:r>
-      <w:r>
-        <w:rPr>
-          <w:rStyle w:val="OperatorTok"/>
-        </w:rPr>
-        <w:t xml:space="preserve">=</w:t>
-      </w:r>
-      <w:r>
-        <w:rPr>
-          <w:rStyle w:val="FloatTok"/>
-        </w:rPr>
-        <w:t xml:space="preserve">5.0</w:t>
-      </w:r>
-      <w:r>
-        <w:rPr>
-          <w:rStyle w:val="NormalTok"/>
-        </w:rPr>
-        <w:t xml:space="preserve">)</w:t>
-      </w:r>
-      <w:r>
-        <w:br/>
-      </w:r>
-      <w:r>
-        <w:rPr>
-          <w:rStyle w:val="BuiltInTok"/>
-        </w:rPr>
-        <w:t xml:space="preserve">print</w:t>
-      </w:r>
-      <w:r>
-        <w:rPr>
-          <w:rStyle w:val="NormalTok"/>
-        </w:rPr>
-        <w:t xml:space="preserve">(n[</w:t>
-      </w:r>
-      <w:r>
-        <w:rPr>
-          <w:rStyle w:val="OperatorTok"/>
-        </w:rPr>
-        <w:t xml:space="preserve">-</w:t>
-      </w:r>
-      <w:r>
-        <w:rPr>
-          <w:rStyle w:val="DecValTok"/>
-        </w:rPr>
-        <w:t xml:space="preserve">1</w:t>
-      </w:r>
-      <w:r>
-        <w:rPr>
-          <w:rStyle w:val="NormalTok"/>
-        </w:rPr>
-        <w:t xml:space="preserve">])  </w:t>
-      </w:r>
-      <w:r>
-        <w:rPr>
-          <w:rStyle w:val="CommentTok"/>
-        </w:rPr>
-        <w:t xml:space="preserve"># -&gt; approaches the carrying capacity</w:t>
-      </w:r>
-    </w:p>
-    <w:bookmarkEnd w:id="430"/>
     <w:p>
       <w:pPr>
         <w:pStyle w:val="FirstParagraph"/>
@@ -34847,8 +34898,8 @@
         </w:pict>
       </w:r>
     </w:p>
-    <w:bookmarkEnd w:id="431"/>
-    <w:bookmarkStart w:id="432" w:name="cross-references-and-citations"/>
+    <w:bookmarkEnd w:id="430"/>
+    <w:bookmarkStart w:id="431" w:name="cross-references-and-citations"/>
     <w:p>
       <w:pPr>
         <w:pStyle w:val="Heading2"/>
@@ -34868,7 +34919,17 @@
         <w:t xml:space="preserve"> </w:t>
       </w:r>
       <w:r>
-        <w:t xml:space="preserve">tbl. 14, equation eq. 17, and section</w:t>
+        <w:t xml:space="preserve">tbl. </w:t>
+      </w:r>
+      <w:r>
+        <w:rPr>
+          <w:b/>
+          <w:bCs/>
+        </w:rPr>
+        <w:t xml:space="preserve">¿tbl:gallery_alignment?</w:t>
+      </w:r>
+      <w:r>
+        <w:t xml:space="preserve">, equation eq. 17, and section</w:t>
       </w:r>
       <w:r>
         <w:t xml:space="preserve"> </w:t>
@@ -34949,8 +35010,8 @@
         </w:pict>
       </w:r>
     </w:p>
-    <w:bookmarkEnd w:id="432"/>
-    <w:bookmarkStart w:id="442" w:name="media-and-data"/>
+    <w:bookmarkEnd w:id="431"/>
+    <w:bookmarkStart w:id="441" w:name="media-and-data"/>
     <w:p>
       <w:pPr>
         <w:pStyle w:val="Heading2"/>
@@ -34967,7 +35028,7 @@
         <w:t xml:space="preserve">Embedded raster image (any PNG/JPG works the same way as a figure):</w:t>
       </w:r>
     </w:p>
-    <w:bookmarkStart w:id="436" w:name="fig:gallery_media"/>
+    <w:bookmarkStart w:id="435" w:name="fig:gallery_media"/>
     <w:p>
       <w:pPr>
         <w:pStyle w:val="CaptionedFigure"/>
@@ -34977,18 +35038,18 @@
           <wp:inline>
             <wp:extent cx="3200400" cy="2155825"/>
             <wp:effectExtent b="0" l="0" r="0" t="0"/>
-            <wp:docPr descr="Figure 17: A generated heatmap embedded as a raster image." title="" id="434" name="Picture"/>
+            <wp:docPr descr="Figure 17: A generated heatmap embedded as a raster image." title="" id="433" name="Picture"/>
             <a:graphic>
               <a:graphicData uri="http://schemas.openxmlformats.org/drawingml/2006/picture">
                 <pic:pic>
                   <pic:nvPicPr>
-                    <pic:cNvPr descr="../figures/gallery/gallery_heatmap.png" id="435" name="Picture"/>
+                    <pic:cNvPr descr="../figures/gallery/gallery_heatmap.png" id="434" name="Picture"/>
                     <pic:cNvPicPr>
                       <a:picLocks noChangeArrowheads="1" noChangeAspect="1"/>
                     </pic:cNvPicPr>
                   </pic:nvPicPr>
                   <pic:blipFill>
-                    <a:blip r:embed="rId433"/>
+                    <a:blip r:embed="rId432"/>
                     <a:stretch>
                       <a:fillRect/>
                     </a:stretch>
@@ -35029,7 +35090,7 @@
         <w:t xml:space="preserve">image.</w:t>
       </w:r>
     </w:p>
-    <w:bookmarkEnd w:id="436"/>
+    <w:bookmarkEnd w:id="435"/>
     <w:p>
       <w:pPr>
         <w:pStyle w:val="BodyText"/>
@@ -35074,7 +35135,7 @@
       <w:r>
         <w:t xml:space="preserve"> </w:t>
       </w:r>
-      <w:hyperlink r:id="rId437">
+      <w:hyperlink r:id="rId436">
         <w:r>
           <w:rPr>
             <w:rStyle w:val="VerbatimChar"/>
@@ -35092,13 +35153,13 @@
         <w:t xml:space="preserve">contents as a table:</w:t>
       </w:r>
     </w:p>
-    <w:bookmarkStart w:id="438" w:name="tbl:gallery_data"/>
+    <w:bookmarkStart w:id="437" w:name="tbl:gallery_data"/>
     <w:p>
       <w:pPr>
         <w:pStyle w:val="TableCaption"/>
       </w:pPr>
       <w:r>
-        <w:t xml:space="preserve">Table 15: Sample dataset (mirrors</w:t>
+        <w:t xml:space="preserve">Table 14: Sample dataset (mirrors</w:t>
       </w:r>
       <w:r>
         <w:t xml:space="preserve"> </w:t>
@@ -35118,7 +35179,7 @@
         <w:tblStyle w:val="Table"/>
         <w:tblW w:type="auto" w:w="0"/>
         <w:tblLook w:firstRow="1" w:lastRow="0" w:firstColumn="0" w:lastColumn="0" w:noHBand="0" w:noVBand="0" w:val="0020"/>
-        <w:tblCaption w:val="Table 15: Sample dataset (mirrors assets/data/sample_dataset.csv)."/>
+        <w:tblCaption w:val="Table 14: Sample dataset (mirrors assets/data/sample_dataset.csv)."/>
       </w:tblPr>
       <w:tblGrid>
         <w:gridCol w:w="1980"/>
@@ -35375,7 +35436,7 @@
         </w:tc>
       </w:tr>
     </w:tbl>
-    <w:bookmarkEnd w:id="438"/>
+    <w:bookmarkEnd w:id="437"/>
     <w:p>
       <w:pPr>
         <w:pStyle w:val="BodyText"/>
@@ -35384,7 +35445,7 @@
         <w:t xml:space="preserve">The error-bar figure fig. 18 visualises this kind of data:</w:t>
       </w:r>
     </w:p>
-    <w:bookmarkStart w:id="441" w:name="fig:gallery_errorbar"/>
+    <w:bookmarkStart w:id="440" w:name="fig:gallery_errorbar"/>
     <w:p>
       <w:pPr>
         <w:pStyle w:val="CaptionedFigure"/>
@@ -35394,12 +35455,12 @@
           <wp:inline>
             <wp:extent cx="3733800" cy="2454002"/>
             <wp:effectExtent b="0" l="0" r="0" t="0"/>
-            <wp:docPr descr="Figure 18: Means with standard-error bars." title="" id="439" name="Picture"/>
+            <wp:docPr descr="Figure 18: Means with standard-error bars." title="" id="438" name="Picture"/>
             <a:graphic>
               <a:graphicData uri="http://schemas.openxmlformats.org/drawingml/2006/picture">
                 <pic:pic>
                   <pic:nvPicPr>
-                    <pic:cNvPr descr="../figures/gallery/gallery_errorbar.png" id="440" name="Picture"/>
+                    <pic:cNvPr descr="../figures/gallery/gallery_errorbar.png" id="439" name="Picture"/>
                     <pic:cNvPicPr>
                       <a:picLocks noChangeArrowheads="1" noChangeAspect="1"/>
                     </pic:cNvPicPr>
@@ -35440,7 +35501,7 @@
         <w:t xml:space="preserve">Figure 18: Means with standard-error bars.</w:t>
       </w:r>
     </w:p>
-    <w:bookmarkEnd w:id="441"/>
+    <w:bookmarkEnd w:id="440"/>
     <w:p>
       <w:r>
         <w:pict>
@@ -35448,8 +35509,8 @@
         </w:pict>
       </w:r>
     </w:p>
-    <w:bookmarkEnd w:id="442"/>
-    <w:bookmarkStart w:id="443" w:name="pedagogical-blocks"/>
+    <w:bookmarkEnd w:id="441"/>
+    <w:bookmarkStart w:id="442" w:name="pedagogical-blocks"/>
     <w:p>
       <w:pPr>
         <w:pStyle w:val="Heading2"/>
@@ -35796,8 +35857,8 @@
         </w:pict>
       </w:r>
     </w:p>
-    <w:bookmarkEnd w:id="443"/>
-    <w:bookmarkStart w:id="444" w:name="miscellany"/>
+    <w:bookmarkEnd w:id="442"/>
+    <w:bookmarkStart w:id="443" w:name="miscellany"/>
     <w:p>
       <w:pPr>
         <w:pStyle w:val="Heading2"/>
@@ -35889,24 +35950,42 @@
         <w:t xml:space="preserve">in equations.</w:t>
       </w:r>
     </w:p>
+    <w:bookmarkEnd w:id="443"/>
     <w:bookmarkEnd w:id="444"/>
+    <w:bookmarkStart w:id="460" w:name="master-glossary"/>
+    <w:p>
+      <w:pPr>
+        <w:pStyle w:val="Heading1"/>
+      </w:pPr>
+      <w:r>
+        <w:t xml:space="preserve">Master Glossary</w:t>
+      </w:r>
+    </w:p>
+    <w:bookmarkStart w:id="445" w:name="gl:boundary"/>
+    <w:p>
+      <w:pPr>
+        <w:pStyle w:val="Heading3"/>
+      </w:pPr>
+      <w:r>
+        <w:t xml:space="preserve">Boundary</w:t>
+      </w:r>
+    </w:p>
+    <w:p>
+      <w:pPr>
+        <w:pStyle w:val="FirstParagraph"/>
+      </w:pPr>
+      <w:r>
+        <w:t xml:space="preserve">The interface separating a system from its environment.</w:t>
+      </w:r>
+    </w:p>
     <w:bookmarkEnd w:id="445"/>
-    <w:bookmarkStart w:id="461" w:name="master-glossary"/>
-    <w:p>
-      <w:pPr>
-        <w:pStyle w:val="Heading1"/>
-      </w:pPr>
-      <w:r>
-        <w:t xml:space="preserve">Master Glossary</w:t>
-      </w:r>
-    </w:p>
-    <w:bookmarkStart w:id="446" w:name="gl:boundary"/>
+    <w:bookmarkStart w:id="446" w:name="gl:dynamics"/>
     <w:p>
       <w:pPr>
         <w:pStyle w:val="Heading3"/>
       </w:pPr>
       <w:r>
-        <w:t xml:space="preserve">Boundary</w:t>
+        <w:t xml:space="preserve">Dynamics</w:t>
       </w:r>
     </w:p>
     <w:p>
@@ -35914,17 +35993,17 @@
         <w:pStyle w:val="FirstParagraph"/>
       </w:pPr>
       <w:r>
-        <w:t xml:space="preserve">The interface separating a system from its environment.</w:t>
+        <w:t xml:space="preserve">How the state of a system changes over time.</w:t>
       </w:r>
     </w:p>
     <w:bookmarkEnd w:id="446"/>
-    <w:bookmarkStart w:id="447" w:name="gl:dynamics"/>
+    <w:bookmarkStart w:id="447" w:name="gl:emergence"/>
     <w:p>
       <w:pPr>
         <w:pStyle w:val="Heading3"/>
       </w:pPr>
       <w:r>
-        <w:t xml:space="preserve">Dynamics</w:t>
+        <w:t xml:space="preserve">Emergence</w:t>
       </w:r>
     </w:p>
     <w:p>
@@ -35932,17 +36011,17 @@
         <w:pStyle w:val="FirstParagraph"/>
       </w:pPr>
       <w:r>
-        <w:t xml:space="preserve">How the state of a system changes over time.</w:t>
+        <w:t xml:space="preserve">System-level behaviour not present in the parts taken alone.</w:t>
       </w:r>
     </w:p>
     <w:bookmarkEnd w:id="447"/>
-    <w:bookmarkStart w:id="448" w:name="gl:emergence"/>
+    <w:bookmarkStart w:id="448" w:name="gl:equilibrium"/>
     <w:p>
       <w:pPr>
         <w:pStyle w:val="Heading3"/>
       </w:pPr>
       <w:r>
-        <w:t xml:space="preserve">Emergence</w:t>
+        <w:t xml:space="preserve">Equilibrium</w:t>
       </w:r>
     </w:p>
     <w:p>
@@ -35950,17 +36029,17 @@
         <w:pStyle w:val="FirstParagraph"/>
       </w:pPr>
       <w:r>
-        <w:t xml:space="preserve">System-level behaviour not present in the parts taken alone.</w:t>
+        <w:t xml:space="preserve">A state in which opposing influences balance and net change is zero.</w:t>
       </w:r>
     </w:p>
     <w:bookmarkEnd w:id="448"/>
-    <w:bookmarkStart w:id="449" w:name="gl:equilibrium"/>
+    <w:bookmarkStart w:id="449" w:name="gl:feedback"/>
     <w:p>
       <w:pPr>
         <w:pStyle w:val="Heading3"/>
       </w:pPr>
       <w:r>
-        <w:t xml:space="preserve">Equilibrium</w:t>
+        <w:t xml:space="preserve">Feedback</w:t>
       </w:r>
     </w:p>
     <w:p>
@@ -35968,17 +36047,17 @@
         <w:pStyle w:val="FirstParagraph"/>
       </w:pPr>
       <w:r>
-        <w:t xml:space="preserve">A state in which opposing influences balance and net change is zero.</w:t>
+        <w:t xml:space="preserve">A loop in which a system’s output influences its own input.</w:t>
       </w:r>
     </w:p>
     <w:bookmarkEnd w:id="449"/>
-    <w:bookmarkStart w:id="450" w:name="gl:feedback"/>
+    <w:bookmarkStart w:id="450" w:name="gl:gradient"/>
     <w:p>
       <w:pPr>
         <w:pStyle w:val="Heading3"/>
       </w:pPr>
       <w:r>
-        <w:t xml:space="preserve">Feedback</w:t>
+        <w:t xml:space="preserve">Gradient</w:t>
       </w:r>
     </w:p>
     <w:p>
@@ -35986,17 +36065,17 @@
         <w:pStyle w:val="FirstParagraph"/>
       </w:pPr>
       <w:r>
-        <w:t xml:space="preserve">A loop in which a system’s output influences its own input.</w:t>
+        <w:t xml:space="preserve">A spatial or quantitative difference that drives flow or change.</w:t>
       </w:r>
     </w:p>
     <w:bookmarkEnd w:id="450"/>
-    <w:bookmarkStart w:id="451" w:name="gl:gradient"/>
+    <w:bookmarkStart w:id="451" w:name="gl:model"/>
     <w:p>
       <w:pPr>
         <w:pStyle w:val="Heading3"/>
       </w:pPr>
       <w:r>
-        <w:t xml:space="preserve">Gradient</w:t>
+        <w:t xml:space="preserve">Model</w:t>
       </w:r>
     </w:p>
     <w:p>
@@ -36004,17 +36083,17 @@
         <w:pStyle w:val="FirstParagraph"/>
       </w:pPr>
       <w:r>
-        <w:t xml:space="preserve">A spatial or quantitative difference that drives flow or change.</w:t>
+        <w:t xml:space="preserve">A simplified, often quantitative, representation of a system.</w:t>
       </w:r>
     </w:p>
     <w:bookmarkEnd w:id="451"/>
-    <w:bookmarkStart w:id="452" w:name="gl:model"/>
+    <w:bookmarkStart w:id="452" w:name="gl:network"/>
     <w:p>
       <w:pPr>
         <w:pStyle w:val="Heading3"/>
       </w:pPr>
       <w:r>
-        <w:t xml:space="preserve">Model</w:t>
+        <w:t xml:space="preserve">Network</w:t>
       </w:r>
     </w:p>
     <w:p>
@@ -36022,17 +36101,17 @@
         <w:pStyle w:val="FirstParagraph"/>
       </w:pPr>
       <w:r>
-        <w:t xml:space="preserve">A simplified, often quantitative, representation of a system.</w:t>
+        <w:t xml:space="preserve">A set of elements (nodes) connected by relationships (edges).</w:t>
       </w:r>
     </w:p>
     <w:bookmarkEnd w:id="452"/>
-    <w:bookmarkStart w:id="453" w:name="gl:network"/>
+    <w:bookmarkStart w:id="453" w:name="gl:observable"/>
     <w:p>
       <w:pPr>
         <w:pStyle w:val="Heading3"/>
       </w:pPr>
       <w:r>
-        <w:t xml:space="preserve">Network</w:t>
+        <w:t xml:space="preserve">Observable</w:t>
       </w:r>
     </w:p>
     <w:p>
@@ -36040,17 +36119,17 @@
         <w:pStyle w:val="FirstParagraph"/>
       </w:pPr>
       <w:r>
-        <w:t xml:space="preserve">A set of elements (nodes) connected by relationships (edges).</w:t>
+        <w:t xml:space="preserve">A quantity that can be measured or recorded.</w:t>
       </w:r>
     </w:p>
     <w:bookmarkEnd w:id="453"/>
-    <w:bookmarkStart w:id="454" w:name="gl:observable"/>
+    <w:bookmarkStart w:id="454" w:name="gl:parameter"/>
     <w:p>
       <w:pPr>
         <w:pStyle w:val="Heading3"/>
       </w:pPr>
       <w:r>
-        <w:t xml:space="preserve">Observable</w:t>
+        <w:t xml:space="preserve">Parameter</w:t>
       </w:r>
     </w:p>
     <w:p>
@@ -36058,17 +36137,17 @@
         <w:pStyle w:val="FirstParagraph"/>
       </w:pPr>
       <w:r>
-        <w:t xml:space="preserve">A quantity that can be measured or recorded.</w:t>
+        <w:t xml:space="preserve">A fixed quantity that configures a model’s behaviour.</w:t>
       </w:r>
     </w:p>
     <w:bookmarkEnd w:id="454"/>
-    <w:bookmarkStart w:id="455" w:name="gl:parameter"/>
+    <w:bookmarkStart w:id="455" w:name="gl:regulation"/>
     <w:p>
       <w:pPr>
         <w:pStyle w:val="Heading3"/>
       </w:pPr>
       <w:r>
-        <w:t xml:space="preserve">Parameter</w:t>
+        <w:t xml:space="preserve">Regulation</w:t>
       </w:r>
     </w:p>
     <w:p>
@@ -36076,17 +36155,17 @@
         <w:pStyle w:val="FirstParagraph"/>
       </w:pPr>
       <w:r>
-        <w:t xml:space="preserve">A fixed quantity that configures a model’s behaviour.</w:t>
+        <w:t xml:space="preserve">The control of a system variable toward a target range.</w:t>
       </w:r>
     </w:p>
     <w:bookmarkEnd w:id="455"/>
-    <w:bookmarkStart w:id="456" w:name="gl:regulation"/>
+    <w:bookmarkStart w:id="456" w:name="gl:state"/>
     <w:p>
       <w:pPr>
         <w:pStyle w:val="Heading3"/>
       </w:pPr>
       <w:r>
-        <w:t xml:space="preserve">Regulation</w:t>
+        <w:t xml:space="preserve">State</w:t>
       </w:r>
     </w:p>
     <w:p>
@@ -36094,17 +36173,17 @@
         <w:pStyle w:val="FirstParagraph"/>
       </w:pPr>
       <w:r>
-        <w:t xml:space="preserve">The control of a system variable toward a target range.</w:t>
+        <w:t xml:space="preserve">The configuration of a system at a moment in time.</w:t>
       </w:r>
     </w:p>
     <w:bookmarkEnd w:id="456"/>
-    <w:bookmarkStart w:id="457" w:name="gl:state"/>
+    <w:bookmarkStart w:id="457" w:name="gl:system"/>
     <w:p>
       <w:pPr>
         <w:pStyle w:val="Heading3"/>
       </w:pPr>
       <w:r>
-        <w:t xml:space="preserve">State</w:t>
+        <w:t xml:space="preserve">System</w:t>
       </w:r>
     </w:p>
     <w:p>
@@ -36112,17 +36191,17 @@
         <w:pStyle w:val="FirstParagraph"/>
       </w:pPr>
       <w:r>
-        <w:t xml:space="preserve">The configuration of a system at a moment in time.</w:t>
+        <w:t xml:space="preserve">A set of interacting parts forming an integrated whole.</w:t>
       </w:r>
     </w:p>
     <w:bookmarkEnd w:id="457"/>
-    <w:bookmarkStart w:id="458" w:name="gl:system"/>
+    <w:bookmarkStart w:id="458" w:name="gl:threshold"/>
     <w:p>
       <w:pPr>
         <w:pStyle w:val="Heading3"/>
       </w:pPr>
       <w:r>
-        <w:t xml:space="preserve">System</w:t>
+        <w:t xml:space="preserve">Threshold</w:t>
       </w:r>
     </w:p>
     <w:p>
@@ -36130,17 +36209,17 @@
         <w:pStyle w:val="FirstParagraph"/>
       </w:pPr>
       <w:r>
-        <w:t xml:space="preserve">A set of interacting parts forming an integrated whole.</w:t>
+        <w:t xml:space="preserve">A critical value at which a qualitative change occurs.</w:t>
       </w:r>
     </w:p>
     <w:bookmarkEnd w:id="458"/>
-    <w:bookmarkStart w:id="459" w:name="gl:threshold"/>
+    <w:bookmarkStart w:id="459" w:name="gl:variable"/>
     <w:p>
       <w:pPr>
         <w:pStyle w:val="Heading3"/>
       </w:pPr>
       <w:r>
-        <w:t xml:space="preserve">Threshold</w:t>
+        <w:t xml:space="preserve">Variable</w:t>
       </w:r>
     </w:p>
     <w:p>
@@ -36148,30 +36227,12 @@
         <w:pStyle w:val="FirstParagraph"/>
       </w:pPr>
       <w:r>
-        <w:t xml:space="preserve">A critical value at which a qualitative change occurs.</w:t>
+        <w:t xml:space="preserve">A quantity that can take different values across states or observations.</w:t>
       </w:r>
     </w:p>
     <w:bookmarkEnd w:id="459"/>
-    <w:bookmarkStart w:id="460" w:name="gl:variable"/>
-    <w:p>
-      <w:pPr>
-        <w:pStyle w:val="Heading3"/>
-      </w:pPr>
-      <w:r>
-        <w:t xml:space="preserve">Variable</w:t>
-      </w:r>
-    </w:p>
-    <w:p>
-      <w:pPr>
-        <w:pStyle w:val="FirstParagraph"/>
-      </w:pPr>
-      <w:r>
-        <w:t xml:space="preserve">A quantity that can take different values across states or observations.</w:t>
-      </w:r>
-    </w:p>
     <w:bookmarkEnd w:id="460"/>
-    <w:bookmarkEnd w:id="461"/>
-    <w:bookmarkStart w:id="474" w:name="sec:appendix_index"/>
+    <w:bookmarkStart w:id="473" w:name="sec:appendix_index"/>
     <w:p>
       <w:pPr>
         <w:pStyle w:val="Heading1"/>
@@ -36341,7 +36402,7 @@
         <w:t xml:space="preserve">.</w:t>
       </w:r>
     </w:p>
-    <w:bookmarkStart w:id="473" w:name="placeholder-entries"/>
+    <w:bookmarkStart w:id="472" w:name="placeholder-entries"/>
     <w:p>
       <w:pPr>
         <w:pStyle w:val="Heading2"/>
@@ -36504,8 +36565,8 @@
         <w:t xml:space="preserve">.</w:t>
       </w:r>
     </w:p>
-    <w:bookmarkStart w:id="472" w:name="refs"/>
-    <w:bookmarkStart w:id="462" w:name="ref-brown2017principles"/>
+    <w:bookmarkStart w:id="471" w:name="refs"/>
+    <w:bookmarkStart w:id="461" w:name="ref-brown2017principles"/>
     <w:p>
       <w:pPr>
         <w:pStyle w:val="Bibliography"/>
@@ -36527,8 +36588,8 @@
         <w:t xml:space="preserve">. Placeholder Press.</w:t>
       </w:r>
     </w:p>
-    <w:bookmarkEnd w:id="462"/>
-    <w:bookmarkStart w:id="463" w:name="ref-doe2019methods"/>
+    <w:bookmarkEnd w:id="461"/>
+    <w:bookmarkStart w:id="462" w:name="ref-doe2019methods"/>
     <w:p>
       <w:pPr>
         <w:pStyle w:val="Bibliography"/>
@@ -36559,8 +36620,8 @@
         <w:t xml:space="preserve">1: 1–20.</w:t>
       </w:r>
     </w:p>
-    <w:bookmarkEnd w:id="463"/>
-    <w:bookmarkStart w:id="464" w:name="ref-garcia2022dynamics"/>
+    <w:bookmarkEnd w:id="462"/>
+    <w:bookmarkStart w:id="463" w:name="ref-garcia2022dynamics"/>
     <w:p>
       <w:pPr>
         <w:pStyle w:val="Bibliography"/>
@@ -36591,8 +36652,8 @@
         <w:t xml:space="preserve">4: 88–110.</w:t>
       </w:r>
     </w:p>
-    <w:bookmarkEnd w:id="464"/>
-    <w:bookmarkStart w:id="465" w:name="ref-kim2020data"/>
+    <w:bookmarkEnd w:id="463"/>
+    <w:bookmarkStart w:id="464" w:name="ref-kim2020data"/>
     <w:p>
       <w:pPr>
         <w:pStyle w:val="Bibliography"/>
@@ -36623,8 +36684,8 @@
         <w:t xml:space="preserve">2: 200–225.</w:t>
       </w:r>
     </w:p>
-    <w:bookmarkEnd w:id="465"/>
-    <w:bookmarkStart w:id="466" w:name="ref-lee2021systems"/>
+    <w:bookmarkEnd w:id="464"/>
+    <w:bookmarkStart w:id="465" w:name="ref-lee2021systems"/>
     <w:p>
       <w:pPr>
         <w:pStyle w:val="Bibliography"/>
@@ -36655,8 +36716,8 @@
         <w:t xml:space="preserve">3: 44–67.</w:t>
       </w:r>
     </w:p>
-    <w:bookmarkEnd w:id="466"/>
-    <w:bookmarkStart w:id="467" w:name="ref-nguyen2023synthesis"/>
+    <w:bookmarkEnd w:id="465"/>
+    <w:bookmarkStart w:id="466" w:name="ref-nguyen2023synthesis"/>
     <w:p>
       <w:pPr>
         <w:pStyle w:val="Bibliography"/>
@@ -36687,8 +36748,8 @@
         <w:t xml:space="preserve">5: 12–34.</w:t>
       </w:r>
     </w:p>
-    <w:bookmarkEnd w:id="467"/>
-    <w:bookmarkStart w:id="468" w:name="ref-patel2018models"/>
+    <w:bookmarkEnd w:id="466"/>
+    <w:bookmarkStart w:id="467" w:name="ref-patel2018models"/>
     <w:p>
       <w:pPr>
         <w:pStyle w:val="Bibliography"/>
@@ -36710,8 +36771,8 @@
         <w:t xml:space="preserve">. Placeholder Press.</w:t>
       </w:r>
     </w:p>
-    <w:bookmarkEnd w:id="468"/>
-    <w:bookmarkStart w:id="469" w:name="ref-smith2020foundations"/>
+    <w:bookmarkEnd w:id="467"/>
+    <w:bookmarkStart w:id="468" w:name="ref-smith2020foundations"/>
     <w:p>
       <w:pPr>
         <w:pStyle w:val="Bibliography"/>
@@ -36733,8 +36794,8 @@
         <w:t xml:space="preserve">. Placeholder Press.</w:t>
       </w:r>
     </w:p>
-    <w:bookmarkEnd w:id="469"/>
-    <w:bookmarkStart w:id="470" w:name="ref-taylor2019theory"/>
+    <w:bookmarkEnd w:id="468"/>
+    <w:bookmarkStart w:id="469" w:name="ref-taylor2019theory"/>
     <w:p>
       <w:pPr>
         <w:pStyle w:val="Bibliography"/>
@@ -36765,8 +36826,8 @@
         <w:t xml:space="preserve">1: 300–330.</w:t>
       </w:r>
     </w:p>
-    <w:bookmarkEnd w:id="470"/>
-    <w:bookmarkStart w:id="471" w:name="ref-wilson2021analysis"/>
+    <w:bookmarkEnd w:id="469"/>
+    <w:bookmarkStart w:id="470" w:name="ref-wilson2021analysis"/>
     <w:p>
       <w:pPr>
         <w:pStyle w:val="Bibliography"/>
@@ -36797,10 +36858,10 @@
         <w:t xml:space="preserve">3: 130–58.</w:t>
       </w:r>
     </w:p>
+    <w:bookmarkEnd w:id="470"/>
     <w:bookmarkEnd w:id="471"/>
     <w:bookmarkEnd w:id="472"/>
     <w:bookmarkEnd w:id="473"/>
-    <w:bookmarkEnd w:id="474"/>
     <w:sectPr>
       <w:footnotePr>
         <w:numRestart w:val="eachSect"/>

</xml_diff>